<commit_message>
feat(operations): natural timestamps, diverse substantive deliverables, and human conversational tone
</commit_message>
<xml_diff>
--- a/public/chat_files/alexa_pitch_rough_bullets.docx
+++ b/public/chat_files/alexa_pitch_rough_bullets.docx
@@ -8,7 +8,7 @@
           <w:b/>
           <w:sz w:val="28"/>
         </w:rPr>
-        <w:t>10-Slide Client Pitch Deck — Bullet Notes</w:t>
+        <w:t>Alexa Quintero — 10-Slide Pitch Outline &amp; Mentor Feedback</w:t>
       </w:r>
     </w:p>
     <w:p>
@@ -16,7 +16,7 @@
         <w:rPr>
           <w:sz w:val="22"/>
         </w:rPr>
-        <w:t xml:space="preserve">Slide 1: Title &amp; value prop for commercial solar O&amp;M</w:t>
+        <w:t xml:space="preserve">Slide 1: Problem statement — Field service companies waste 14 hrs/week on paper dispatch.</w:t>
       </w:r>
     </w:p>
     <w:p>
@@ -24,7 +24,7 @@
         <w:rPr>
           <w:sz w:val="22"/>
         </w:rPr>
-        <w:t xml:space="preserve">Slide 2: Why panel output drops 14-18% without scheduled wash &amp; thermal inspection</w:t>
+        <w:t xml:space="preserve">Slide 2: Solution — Automated dispatch &amp; electronic signoff on mobile.</w:t>
       </w:r>
     </w:p>
     <w:p>
@@ -32,7 +32,7 @@
         <w:rPr>
           <w:sz w:val="22"/>
         </w:rPr>
-        <w:t xml:space="preserve">Slide 3: Our inspection + preventative maintenance workflow</w:t>
+        <w:t xml:space="preserve">Slide 3: Market Size — $8.2B TAM in North American trade logistics.</w:t>
       </w:r>
     </w:p>
     <w:p>
@@ -40,7 +40,15 @@
         <w:rPr>
           <w:sz w:val="22"/>
         </w:rPr>
-        <w:t xml:space="preserve">Slide 4-10: Pricing tiers, competitor comparison, case study, and Q4 rollout schedule.</w:t>
+        <w:t xml:space="preserve">Slide 4: Traction — 28 pilot contractors, $14K MRR, zero churn in 90 days.</w:t>
+      </w:r>
+    </w:p>
+    <w:p>
+      <w:r>
+        <w:rPr>
+          <w:sz w:val="22"/>
+        </w:rPr>
+        <w:t xml:space="preserve">Mentors say: Sharpen unit economics and customer acquisition playbook.</w:t>
       </w:r>
     </w:p>
   </w:body>

</xml_diff>

<commit_message>
feat: host Audrey Brown live showcase website and enrich all client deliverables with complete real data
- Create live hosted Studio Brown website at /showcase/studio-brown/ and /studio-brown/ with responsive layout, 3 transparent packages, 5-field booking intake, and custom GitHub repository link
- Upgrade chat PDF generator to ReportLab Flowables for multi-page layouts and clean typography, resolving Unicode glyph issues
- Upgrade DOCX generator with formatted headings, line spacing, and styled indented bullets
- Completely enrich deliverables across all client threads (Issa Cuevas 4-page agreement, Estella Williams 16-slide PPTX and financial model, Jack Johnson enterprise deck and CRM spec, Keegan Chin SOP manual, Azael Orozco 4-page roofing copy deck, Luca Carollo charter brochure and distribution model, Lina Rickert 5-email retention sequence, Carter Lemburg 25-point launch checklist)
- Pass all 47 test suite cases and add regression test for showcase endpoint
</commit_message>
<xml_diff>
--- a/public/chat_files/alexa_pitch_rough_bullets.docx
+++ b/public/chat_files/alexa_pitch_rough_bullets.docx
@@ -3,50 +3,74 @@
 <w:document xmlns:w="http://schemas.openxmlformats.org/wordprocessingml/2006/main">
   <w:body>
     <w:p>
+      <w:pPr>
+        <w:spacing w:before="120" w:after="240"/>
+      </w:pPr>
       <w:r>
         <w:rPr>
           <w:b/>
-          <w:sz w:val="28"/>
+          <w:color w:val="0F172A"/>
+          <w:sz w:val="32"/>
         </w:rPr>
-        <w:t>Alexa Quintero — 10-Slide Pitch Outline &amp; Mentor Feedback</w:t>
+        <w:t xml:space="preserve">Alexa Quintero — 10-Slide Pitch Outline &amp; Mentor Feedback</w:t>
       </w:r>
     </w:p>
     <w:p>
+      <w:pPr>
+        <w:spacing w:after="140" w:line="276" w:lineRule="auto"/>
+      </w:pPr>
       <w:r>
         <w:rPr>
-          <w:sz w:val="22"/>
+          <w:color w:val="1E293B"/>
+          <w:sz w:val="21"/>
         </w:rPr>
         <w:t xml:space="preserve">Slide 1: Problem statement — Field service companies waste 14 hrs/week on paper dispatch.</w:t>
       </w:r>
     </w:p>
     <w:p>
+      <w:pPr>
+        <w:spacing w:after="140" w:line="276" w:lineRule="auto"/>
+      </w:pPr>
       <w:r>
         <w:rPr>
-          <w:sz w:val="22"/>
+          <w:color w:val="1E293B"/>
+          <w:sz w:val="21"/>
         </w:rPr>
         <w:t xml:space="preserve">Slide 2: Solution — Automated dispatch &amp; electronic signoff on mobile.</w:t>
       </w:r>
     </w:p>
     <w:p>
+      <w:pPr>
+        <w:spacing w:after="140" w:line="276" w:lineRule="auto"/>
+      </w:pPr>
       <w:r>
         <w:rPr>
-          <w:sz w:val="22"/>
+          <w:color w:val="1E293B"/>
+          <w:sz w:val="21"/>
         </w:rPr>
         <w:t xml:space="preserve">Slide 3: Market Size — $8.2B TAM in North American trade logistics.</w:t>
       </w:r>
     </w:p>
     <w:p>
+      <w:pPr>
+        <w:spacing w:after="140" w:line="276" w:lineRule="auto"/>
+      </w:pPr>
       <w:r>
         <w:rPr>
-          <w:sz w:val="22"/>
+          <w:color w:val="1E293B"/>
+          <w:sz w:val="21"/>
         </w:rPr>
         <w:t xml:space="preserve">Slide 4: Traction — 28 pilot contractors, $14K MRR, zero churn in 90 days.</w:t>
       </w:r>
     </w:p>
     <w:p>
+      <w:pPr>
+        <w:spacing w:after="140" w:line="276" w:lineRule="auto"/>
+      </w:pPr>
       <w:r>
         <w:rPr>
-          <w:sz w:val="22"/>
+          <w:color w:val="1E293B"/>
+          <w:sz w:val="21"/>
         </w:rPr>
         <w:t xml:space="preserve">Mentors say: Sharpen unit economics and customer acquisition playbook.</w:t>
       </w:r>

</xml_diff>

<commit_message>
feat(deliverables): overhaul all client source docs and drafts with authentic high-density multi-page content
</commit_message>
<xml_diff>
--- a/public/chat_files/alexa_pitch_rough_bullets.docx
+++ b/public/chat_files/alexa_pitch_rough_bullets.docx
@@ -13,7 +13,7 @@
           <w:color w:val="0F172A"/>
           <w:sz w:val="44"/>
         </w:rPr>
-        <w:t>Alexa Quintero — 10-Slide Pitch Outline &amp; Mentor Feedback</w:t>
+        <w:t>FleetOps Trades Mobile Dispatch — Founder Problem Discovery &amp; Seed Pitch Notes</w:t>
       </w:r>
     </w:p>
     <w:p>
@@ -26,7 +26,7 @@
           <w:color w:val="1E293B"/>
           <w:sz w:val="20"/>
         </w:rPr>
-        <w:t>Slide 1: Problem statement — Field service companies waste 14 hrs/week on paper dispatch.</w:t>
+        <w:t>COMPANY: FleetOps Technologies, Inc. · Austin &amp; Denver</w:t>
       </w:r>
     </w:p>
     <w:p>
@@ -39,7 +39,7 @@
           <w:color w:val="1E293B"/>
           <w:sz w:val="20"/>
         </w:rPr>
-        <w:t>Slide 2: Solution — Automated dispatch &amp; electronic signoff on mobile.</w:t>
+        <w:t>FOUNDER &amp; CEO: Alexa Quintero</w:t>
       </w:r>
     </w:p>
     <w:p>
@@ -52,7 +52,7 @@
           <w:color w:val="1E293B"/>
           <w:sz w:val="20"/>
         </w:rPr>
-        <w:t>Slide 3: Market Size — $8.2B TAM in North American trade logistics.</w:t>
+        <w:t>TARGET VERTICAL: Commercial Trade Fleets (Commercial HVAC, Electrical, Commercial Plumbing, Refrigeration)</w:t>
       </w:r>
     </w:p>
     <w:p>
@@ -65,7 +65,27 @@
           <w:color w:val="1E293B"/>
           <w:sz w:val="20"/>
         </w:rPr>
-        <w:t>Slide 4: Traction — 28 pilot contractors, $14K MRR, zero churn in 90 days.</w:t>
+        <w:t>DOCUMENT: Founder Discovery Notes, 35 Contractor Interviews &amp; Seed Financing Architecture</w:t>
+      </w:r>
+    </w:p>
+    <w:p>
+      <w:r>
+        <w:br w:type="page"/>
+      </w:r>
+    </w:p>
+    <w:p>
+      <w:pPr>
+        <w:keepNext/>
+        <w:spacing w:before="280" w:after="80"/>
+      </w:pPr>
+      <w:r>
+        <w:rPr>
+          <w:rFonts w:ascii="Calibri" w:hAnsi="Calibri"/>
+          <w:b/>
+          <w:color w:val="0F172A"/>
+          <w:sz w:val="26"/>
+        </w:rPr>
+        <w:t>SECTION 1: THE DISCONNECTED COMMERCIAL TRADE FLEET</w:t>
       </w:r>
     </w:p>
     <w:p>
@@ -78,7 +98,388 @@
           <w:color w:val="1E293B"/>
           <w:sz w:val="20"/>
         </w:rPr>
-        <w:t>Mentors say: Sharpen unit economics and customer acquisition playbook.</w:t>
+        <w:t>Over four months in summer 2026, Alexa Quintero conducted in-depth, ride-along discovery interviews with thirty-five (35) commercial trade contractors operating between 8 and 60 service vans across Texas, Colorado, and Arizona.</w:t>
+      </w:r>
+    </w:p>
+    <w:p>
+      <w:pPr>
+        <w:spacing w:before="0" w:after="120" w:line="276" w:lineRule="auto"/>
+      </w:pPr>
+      <w:r>
+        <w:rPr>
+          <w:rFonts w:ascii="Calibri" w:hAnsi="Calibri"/>
+          <w:color w:val="1E293B"/>
+          <w:sz w:val="20"/>
+        </w:rPr>
+        <w:t>The central discovery: While residential trade dispatch software has matured (ServiceTitan, Housecall Pro, Jobber), commercial trade fleets operate with fundamentally different requirements that consumer-facing apps fail to address.</w:t>
+      </w:r>
+    </w:p>
+    <w:p>
+      <w:pPr>
+        <w:spacing w:before="0" w:after="120" w:line="276" w:lineRule="auto"/>
+      </w:pPr>
+      <w:r>
+        <w:rPr>
+          <w:rFonts w:ascii="Calibri" w:hAnsi="Calibri"/>
+          <w:color w:val="1E293B"/>
+          <w:sz w:val="20"/>
+        </w:rPr>
+        <w:t>Key Commercial Differences:</w:t>
+      </w:r>
+    </w:p>
+    <w:p>
+      <w:pPr>
+        <w:pStyle w:val="ListBullet"/>
+        <w:spacing w:before="0" w:after="60" w:line="276" w:lineRule="auto"/>
+      </w:pPr>
+      <w:r>
+        <w:rPr>
+          <w:rFonts w:ascii="Calibri" w:hAnsi="Calibri"/>
+          <w:color w:val="1E293B"/>
+          <w:sz w:val="20"/>
+        </w:rPr>
+        <w:t>Multi-Day Industrial Work Orders: Residential apps assume a 90-minute service call with a homeowner. Commercial contractors manage 3-week boiler replacements and chiller overhauls across multiple shift technicians.</w:t>
+      </w:r>
+    </w:p>
+    <w:p>
+      <w:pPr>
+        <w:pStyle w:val="ListBullet"/>
+        <w:spacing w:before="0" w:after="60" w:line="276" w:lineRule="auto"/>
+      </w:pPr>
+      <w:r>
+        <w:rPr>
+          <w:rFonts w:ascii="Calibri" w:hAnsi="Calibri"/>
+          <w:color w:val="1E293B"/>
+          <w:sz w:val="20"/>
+        </w:rPr>
+        <w:t>Basement &amp; Mechanical Room Dead-Zones: Commercial technicians work in subterranean hospital mechanical rooms, concrete parking garages, and industrial manufacturing plants with zero cellular reception. Existing cloud-only apps completely freeze or lose un-synced work orders.</w:t>
+      </w:r>
+    </w:p>
+    <w:p>
+      <w:pPr>
+        <w:pStyle w:val="ListBullet"/>
+        <w:spacing w:before="0" w:after="60" w:line="276" w:lineRule="auto"/>
+      </w:pPr>
+      <w:r>
+        <w:rPr>
+          <w:rFonts w:ascii="Calibri" w:hAnsi="Calibri"/>
+          <w:color w:val="1E293B"/>
+          <w:sz w:val="20"/>
+        </w:rPr>
+        <w:t>Complex Job Costing &amp; Equipment Asset Tracking: Commercial customers demand rooftop HVAC unit asset history, refrigerant reclamation EPA compliance logs, and exact labor-material margin tracking against commercial purchase orders.</w:t>
+      </w:r>
+    </w:p>
+    <w:p>
+      <w:r>
+        <w:br w:type="page"/>
+      </w:r>
+    </w:p>
+    <w:p>
+      <w:pPr>
+        <w:keepNext/>
+        <w:spacing w:before="280" w:after="80"/>
+      </w:pPr>
+      <w:r>
+        <w:rPr>
+          <w:rFonts w:ascii="Calibri" w:hAnsi="Calibri"/>
+          <w:b/>
+          <w:color w:val="0F172A"/>
+          <w:sz w:val="26"/>
+        </w:rPr>
+        <w:t>SECTION 2: WHY CONTRACTORS ARE FLEEING SERVICETITAN</w:t>
+      </w:r>
+    </w:p>
+    <w:p>
+      <w:pPr>
+        <w:spacing w:before="0" w:after="120" w:line="276" w:lineRule="auto"/>
+      </w:pPr>
+      <w:r>
+        <w:rPr>
+          <w:rFonts w:ascii="Calibri" w:hAnsi="Calibri"/>
+          <w:color w:val="1E293B"/>
+          <w:sz w:val="20"/>
+        </w:rPr>
+        <w:t>Interviews revealed intense contractor frustration with incumbent field service software:</w:t>
+      </w:r>
+    </w:p>
+    <w:p>
+      <w:pPr>
+        <w:spacing w:before="0" w:after="120" w:line="276" w:lineRule="auto"/>
+      </w:pPr>
+      <w:r>
+        <w:rPr>
+          <w:rFonts w:ascii="Calibri" w:hAnsi="Calibri"/>
+          <w:color w:val="1E293B"/>
+          <w:sz w:val="20"/>
+        </w:rPr>
+        <w:t>1. Pricing Hostage Architecture: ServiceTitan charges $250 to $350 per technician per month, plus exorbitant setup fees ($8,000 to $15,000) and mandatory long-term lock-in contracts.</w:t>
+      </w:r>
+    </w:p>
+    <w:p>
+      <w:pPr>
+        <w:spacing w:before="0" w:after="120" w:line="276" w:lineRule="auto"/>
+      </w:pPr>
+      <w:r>
+        <w:rPr>
+          <w:rFonts w:ascii="Calibri" w:hAnsi="Calibri"/>
+          <w:color w:val="1E293B"/>
+          <w:sz w:val="20"/>
+        </w:rPr>
+        <w:t>2. Feature Bloat &amp; Complexity: Technicians need 45 minutes of training just to close an invoice. Older, experienced journeymen mechanics refuse to use the tablet because the user interface is bloated with consumer marketing upsells.</w:t>
+      </w:r>
+    </w:p>
+    <w:p>
+      <w:pPr>
+        <w:spacing w:before="0" w:after="120" w:line="276" w:lineRule="auto"/>
+      </w:pPr>
+      <w:r>
+        <w:rPr>
+          <w:rFonts w:ascii="Calibri" w:hAnsi="Calibri"/>
+          <w:color w:val="1E293B"/>
+          <w:sz w:val="20"/>
+        </w:rPr>
+        <w:t>3. Cloud Sync Failures: When a technician loses cellular connectivity in a commercial basement, ServiceTitan locks up. Technicians revert to paper work orders, destroying real-time office visibility.</w:t>
+      </w:r>
+    </w:p>
+    <w:p>
+      <w:r>
+        <w:br w:type="page"/>
+      </w:r>
+    </w:p>
+    <w:p>
+      <w:pPr>
+        <w:keepNext/>
+        <w:spacing w:before="280" w:after="80"/>
+      </w:pPr>
+      <w:r>
+        <w:rPr>
+          <w:rFonts w:ascii="Calibri" w:hAnsi="Calibri"/>
+          <w:b/>
+          <w:color w:val="0F172A"/>
+          <w:sz w:val="26"/>
+        </w:rPr>
+        <w:t>SECTION 3: THE FLEETOPS OFFLINE-FIRST ENGINE</w:t>
+      </w:r>
+    </w:p>
+    <w:p>
+      <w:pPr>
+        <w:spacing w:before="0" w:after="120" w:line="276" w:lineRule="auto"/>
+      </w:pPr>
+      <w:r>
+        <w:rPr>
+          <w:rFonts w:ascii="Calibri" w:hAnsi="Calibri"/>
+          <w:color w:val="1E293B"/>
+          <w:sz w:val="20"/>
+        </w:rPr>
+        <w:t>FleetOps was engineered from day one on an offline-first mobile architecture:</w:t>
+      </w:r>
+    </w:p>
+    <w:p>
+      <w:pPr>
+        <w:pStyle w:val="ListBullet"/>
+        <w:spacing w:before="0" w:after="60" w:line="276" w:lineRule="auto"/>
+      </w:pPr>
+      <w:r>
+        <w:rPr>
+          <w:rFonts w:ascii="Calibri" w:hAnsi="Calibri"/>
+          <w:color w:val="1E293B"/>
+          <w:sz w:val="20"/>
+        </w:rPr>
+        <w:t>Embedded Local SQLite Engine: Every work order, customer asset history, and price book item is stored directly in an encrypted local database on the technician's mobile device.</w:t>
+      </w:r>
+    </w:p>
+    <w:p>
+      <w:pPr>
+        <w:pStyle w:val="ListBullet"/>
+        <w:spacing w:before="0" w:after="60" w:line="276" w:lineRule="auto"/>
+      </w:pPr>
+      <w:r>
+        <w:rPr>
+          <w:rFonts w:ascii="Calibri" w:hAnsi="Calibri"/>
+          <w:color w:val="1E293B"/>
+          <w:sz w:val="20"/>
+        </w:rPr>
+        <w:t>Conflict-Free Replicated Data Types (CRDT): When the technician walks out of the basement into cellular coverage, FleetOps executes seamless, bi-directional background synchronization in milliseconds with zero merge conflicts.</w:t>
+      </w:r>
+    </w:p>
+    <w:p>
+      <w:pPr>
+        <w:pStyle w:val="ListBullet"/>
+        <w:spacing w:before="0" w:after="60" w:line="276" w:lineRule="auto"/>
+      </w:pPr>
+      <w:r>
+        <w:rPr>
+          <w:rFonts w:ascii="Calibri" w:hAnsi="Calibri"/>
+          <w:color w:val="1E293B"/>
+          <w:sz w:val="20"/>
+        </w:rPr>
+        <w:t>1-Click Mobile Invoice Generation: Technicians snap a photo of the completed equipment nameplate, review recorded labor hours, and generate an itemized commercial PDF invoice before climbing back into their van.</w:t>
+      </w:r>
+    </w:p>
+    <w:p>
+      <w:r>
+        <w:br w:type="page"/>
+      </w:r>
+    </w:p>
+    <w:p>
+      <w:pPr>
+        <w:keepNext/>
+        <w:spacing w:before="280" w:after="80"/>
+      </w:pPr>
+      <w:r>
+        <w:rPr>
+          <w:rFonts w:ascii="Calibri" w:hAnsi="Calibri"/>
+          <w:b/>
+          <w:color w:val="0F172A"/>
+          <w:sz w:val="26"/>
+        </w:rPr>
+        <w:t>SECTION 4: TRACTION &amp; PILOT UNIT ECONOMICS</w:t>
+      </w:r>
+    </w:p>
+    <w:p>
+      <w:pPr>
+        <w:pStyle w:val="ListBullet"/>
+        <w:spacing w:before="0" w:after="60" w:line="276" w:lineRule="auto"/>
+      </w:pPr>
+      <w:r>
+        <w:rPr>
+          <w:rFonts w:ascii="Calibri" w:hAnsi="Calibri"/>
+          <w:color w:val="1E293B"/>
+          <w:sz w:val="20"/>
+        </w:rPr>
+        <w:t>Active Commercial Contractors: 38 commercial trade contractors deployed across Austin, Dallas, and Denver.</w:t>
+      </w:r>
+    </w:p>
+    <w:p>
+      <w:pPr>
+        <w:pStyle w:val="ListBullet"/>
+        <w:spacing w:before="0" w:after="60" w:line="276" w:lineRule="auto"/>
+      </w:pPr>
+      <w:r>
+        <w:rPr>
+          <w:rFonts w:ascii="Calibri" w:hAnsi="Calibri"/>
+          <w:color w:val="1E293B"/>
+          <w:sz w:val="20"/>
+        </w:rPr>
+        <w:t>Active Mobile Technicians: 182 daily active technicians using FleetOps on iOS and Android.</w:t>
+      </w:r>
+    </w:p>
+    <w:p>
+      <w:pPr>
+        <w:pStyle w:val="ListBullet"/>
+        <w:spacing w:before="0" w:after="60" w:line="276" w:lineRule="auto"/>
+      </w:pPr>
+      <w:r>
+        <w:rPr>
+          <w:rFonts w:ascii="Calibri" w:hAnsi="Calibri"/>
+          <w:color w:val="1E293B"/>
+          <w:sz w:val="20"/>
+        </w:rPr>
+        <w:t>Monthly Recurring Revenue (MRR): $42,600 as of October 2026 (growing 18.5% month-over-month).</w:t>
+      </w:r>
+    </w:p>
+    <w:p>
+      <w:pPr>
+        <w:pStyle w:val="ListBullet"/>
+        <w:spacing w:before="0" w:after="60" w:line="276" w:lineRule="auto"/>
+      </w:pPr>
+      <w:r>
+        <w:rPr>
+          <w:rFonts w:ascii="Calibri" w:hAnsi="Calibri"/>
+          <w:color w:val="1E293B"/>
+          <w:sz w:val="20"/>
+        </w:rPr>
+        <w:t>Net Revenue Retention (NRR): 118.4% driven by contractors adding new technician seats as they expand.</w:t>
+      </w:r>
+    </w:p>
+    <w:p>
+      <w:pPr>
+        <w:pStyle w:val="ListBullet"/>
+        <w:spacing w:before="0" w:after="60" w:line="276" w:lineRule="auto"/>
+      </w:pPr>
+      <w:r>
+        <w:rPr>
+          <w:rFonts w:ascii="Calibri" w:hAnsi="Calibri"/>
+          <w:color w:val="1E293B"/>
+          <w:sz w:val="20"/>
+        </w:rPr>
+        <w:t>Gross Churn: Under 0.8% monthly (industry standard is 2.5%).</w:t>
+      </w:r>
+    </w:p>
+    <w:p>
+      <w:r>
+        <w:br w:type="page"/>
+      </w:r>
+    </w:p>
+    <w:p>
+      <w:pPr>
+        <w:keepNext/>
+        <w:spacing w:before="280" w:after="80"/>
+      </w:pPr>
+      <w:r>
+        <w:rPr>
+          <w:rFonts w:ascii="Calibri" w:hAnsi="Calibri"/>
+          <w:b/>
+          <w:color w:val="0F172A"/>
+          <w:sz w:val="26"/>
+        </w:rPr>
+        <w:t>SECTION 5: SEED FINANCING TERMS &amp; CAPITAL ALLOCATION</w:t>
+      </w:r>
+    </w:p>
+    <w:p>
+      <w:pPr>
+        <w:pStyle w:val="ListBullet"/>
+        <w:spacing w:before="0" w:after="60" w:line="276" w:lineRule="auto"/>
+      </w:pPr>
+      <w:r>
+        <w:rPr>
+          <w:rFonts w:ascii="Calibri" w:hAnsi="Calibri"/>
+          <w:color w:val="1E293B"/>
+          <w:sz w:val="20"/>
+        </w:rPr>
+        <w:t>Round Size: $1,800,000 Seed Preferred Stock Financing.</w:t>
+      </w:r>
+    </w:p>
+    <w:p>
+      <w:pPr>
+        <w:pStyle w:val="ListBullet"/>
+        <w:spacing w:before="0" w:after="60" w:line="276" w:lineRule="auto"/>
+      </w:pPr>
+      <w:r>
+        <w:rPr>
+          <w:rFonts w:ascii="Calibri" w:hAnsi="Calibri"/>
+          <w:color w:val="1E293B"/>
+          <w:sz w:val="20"/>
+        </w:rPr>
+        <w:t>Valuation Cap: $9,000,000 Post-Money Valuation.</w:t>
+      </w:r>
+    </w:p>
+    <w:p>
+      <w:pPr>
+        <w:pStyle w:val="ListBullet"/>
+        <w:spacing w:before="0" w:after="60" w:line="276" w:lineRule="auto"/>
+      </w:pPr>
+      <w:r>
+        <w:rPr>
+          <w:rFonts w:ascii="Calibri" w:hAnsi="Calibri"/>
+          <w:color w:val="1E293B"/>
+          <w:sz w:val="20"/>
+        </w:rPr>
+        <w:t>Capital Deployment: 60% Engineering (scaling offline sync, ERP accounting connectors), 25% Go-To-Market (inside sales targeting commercial trade associations), 15% Operational reserves.</w:t>
+      </w:r>
+    </w:p>
+    <w:p>
+      <w:pPr>
+        <w:pStyle w:val="ListBullet"/>
+        <w:spacing w:before="0" w:after="60" w:line="276" w:lineRule="auto"/>
+      </w:pPr>
+      <w:r>
+        <w:rPr>
+          <w:rFonts w:ascii="Calibri" w:hAnsi="Calibri"/>
+          <w:color w:val="1E293B"/>
+          <w:sz w:val="20"/>
+        </w:rPr>
+        <w:t>18-Month Milestone: Scale from $42k MRR to $200k MRR ($2.4M ARR run-rate) to position for a top-tier Series A.</w:t>
       </w:r>
     </w:p>
     <w:sectPr>
@@ -115,7 +516,7 @@
       <w:jc w:val="right"/>
     </w:pPr>
     <w:r>
-      <w:t>Alexa Quintero — 10-Slide Pitch Outline &amp; Mentor Feedback</w:t>
+      <w:t xml:space="preserve">FleetOps Trades Mobile Dispatch — Founder Problem Discovery </w:t>
     </w:r>
   </w:p>
 </w:hdr>

</xml_diff>

<commit_message>
fix(seed): safely distinguish file contents from disk paths in write_zip_file to prevent Linux OSError Errno 36
</commit_message>
<xml_diff>
--- a/public/chat_files/alexa_pitch_rough_bullets.docx
+++ b/public/chat_files/alexa_pitch_rough_bullets.docx
@@ -13,7 +13,7 @@
           <w:color w:val="0F172A"/>
           <w:sz w:val="44"/>
         </w:rPr>
-        <w:t>FleetOps Trades Mobile Dispatch — Founder Problem Discovery &amp; Seed Pitch Notes</w:t>
+        <w:t>Alexa Quintero — 10-Slide Pitch Outline &amp; Mentor Feedback</w:t>
       </w:r>
     </w:p>
     <w:p>
@@ -26,7 +26,7 @@
           <w:color w:val="1E293B"/>
           <w:sz w:val="20"/>
         </w:rPr>
-        <w:t>COMPANY: FleetOps Technologies, Inc. · Austin &amp; Denver</w:t>
+        <w:t>Slide 1: Problem statement — Field service companies waste 14 hrs/week on paper dispatch.</w:t>
       </w:r>
     </w:p>
     <w:p>
@@ -39,7 +39,7 @@
           <w:color w:val="1E293B"/>
           <w:sz w:val="20"/>
         </w:rPr>
-        <w:t>FOUNDER &amp; CEO: Alexa Quintero</w:t>
+        <w:t>Slide 2: Solution — Automated dispatch &amp; electronic signoff on mobile.</w:t>
       </w:r>
     </w:p>
     <w:p>
@@ -52,7 +52,7 @@
           <w:color w:val="1E293B"/>
           <w:sz w:val="20"/>
         </w:rPr>
-        <w:t>TARGET VERTICAL: Commercial Trade Fleets (Commercial HVAC, Electrical, Commercial Plumbing, Refrigeration)</w:t>
+        <w:t>Slide 3: Market Size — $8.2B TAM in North American trade logistics.</w:t>
       </w:r>
     </w:p>
     <w:p>
@@ -65,27 +65,7 @@
           <w:color w:val="1E293B"/>
           <w:sz w:val="20"/>
         </w:rPr>
-        <w:t>DOCUMENT: Founder Discovery Notes, 35 Contractor Interviews &amp; Seed Financing Architecture</w:t>
-      </w:r>
-    </w:p>
-    <w:p>
-      <w:r>
-        <w:br w:type="page"/>
-      </w:r>
-    </w:p>
-    <w:p>
-      <w:pPr>
-        <w:keepNext/>
-        <w:spacing w:before="280" w:after="80"/>
-      </w:pPr>
-      <w:r>
-        <w:rPr>
-          <w:rFonts w:ascii="Calibri" w:hAnsi="Calibri"/>
-          <w:b/>
-          <w:color w:val="0F172A"/>
-          <w:sz w:val="26"/>
-        </w:rPr>
-        <w:t>SECTION 1: THE DISCONNECTED COMMERCIAL TRADE FLEET</w:t>
+        <w:t>Slide 4: Traction — 28 pilot contractors, $14K MRR, zero churn in 90 days.</w:t>
       </w:r>
     </w:p>
     <w:p>
@@ -98,388 +78,7 @@
           <w:color w:val="1E293B"/>
           <w:sz w:val="20"/>
         </w:rPr>
-        <w:t>Over four months in summer 2026, Alexa Quintero conducted in-depth, ride-along discovery interviews with thirty-five (35) commercial trade contractors operating between 8 and 60 service vans across Texas, Colorado, and Arizona.</w:t>
-      </w:r>
-    </w:p>
-    <w:p>
-      <w:pPr>
-        <w:spacing w:before="0" w:after="120" w:line="276" w:lineRule="auto"/>
-      </w:pPr>
-      <w:r>
-        <w:rPr>
-          <w:rFonts w:ascii="Calibri" w:hAnsi="Calibri"/>
-          <w:color w:val="1E293B"/>
-          <w:sz w:val="20"/>
-        </w:rPr>
-        <w:t>The central discovery: While residential trade dispatch software has matured (ServiceTitan, Housecall Pro, Jobber), commercial trade fleets operate with fundamentally different requirements that consumer-facing apps fail to address.</w:t>
-      </w:r>
-    </w:p>
-    <w:p>
-      <w:pPr>
-        <w:spacing w:before="0" w:after="120" w:line="276" w:lineRule="auto"/>
-      </w:pPr>
-      <w:r>
-        <w:rPr>
-          <w:rFonts w:ascii="Calibri" w:hAnsi="Calibri"/>
-          <w:color w:val="1E293B"/>
-          <w:sz w:val="20"/>
-        </w:rPr>
-        <w:t>Key Commercial Differences:</w:t>
-      </w:r>
-    </w:p>
-    <w:p>
-      <w:pPr>
-        <w:pStyle w:val="ListBullet"/>
-        <w:spacing w:before="0" w:after="60" w:line="276" w:lineRule="auto"/>
-      </w:pPr>
-      <w:r>
-        <w:rPr>
-          <w:rFonts w:ascii="Calibri" w:hAnsi="Calibri"/>
-          <w:color w:val="1E293B"/>
-          <w:sz w:val="20"/>
-        </w:rPr>
-        <w:t>Multi-Day Industrial Work Orders: Residential apps assume a 90-minute service call with a homeowner. Commercial contractors manage 3-week boiler replacements and chiller overhauls across multiple shift technicians.</w:t>
-      </w:r>
-    </w:p>
-    <w:p>
-      <w:pPr>
-        <w:pStyle w:val="ListBullet"/>
-        <w:spacing w:before="0" w:after="60" w:line="276" w:lineRule="auto"/>
-      </w:pPr>
-      <w:r>
-        <w:rPr>
-          <w:rFonts w:ascii="Calibri" w:hAnsi="Calibri"/>
-          <w:color w:val="1E293B"/>
-          <w:sz w:val="20"/>
-        </w:rPr>
-        <w:t>Basement &amp; Mechanical Room Dead-Zones: Commercial technicians work in subterranean hospital mechanical rooms, concrete parking garages, and industrial manufacturing plants with zero cellular reception. Existing cloud-only apps completely freeze or lose un-synced work orders.</w:t>
-      </w:r>
-    </w:p>
-    <w:p>
-      <w:pPr>
-        <w:pStyle w:val="ListBullet"/>
-        <w:spacing w:before="0" w:after="60" w:line="276" w:lineRule="auto"/>
-      </w:pPr>
-      <w:r>
-        <w:rPr>
-          <w:rFonts w:ascii="Calibri" w:hAnsi="Calibri"/>
-          <w:color w:val="1E293B"/>
-          <w:sz w:val="20"/>
-        </w:rPr>
-        <w:t>Complex Job Costing &amp; Equipment Asset Tracking: Commercial customers demand rooftop HVAC unit asset history, refrigerant reclamation EPA compliance logs, and exact labor-material margin tracking against commercial purchase orders.</w:t>
-      </w:r>
-    </w:p>
-    <w:p>
-      <w:r>
-        <w:br w:type="page"/>
-      </w:r>
-    </w:p>
-    <w:p>
-      <w:pPr>
-        <w:keepNext/>
-        <w:spacing w:before="280" w:after="80"/>
-      </w:pPr>
-      <w:r>
-        <w:rPr>
-          <w:rFonts w:ascii="Calibri" w:hAnsi="Calibri"/>
-          <w:b/>
-          <w:color w:val="0F172A"/>
-          <w:sz w:val="26"/>
-        </w:rPr>
-        <w:t>SECTION 2: WHY CONTRACTORS ARE FLEEING SERVICETITAN</w:t>
-      </w:r>
-    </w:p>
-    <w:p>
-      <w:pPr>
-        <w:spacing w:before="0" w:after="120" w:line="276" w:lineRule="auto"/>
-      </w:pPr>
-      <w:r>
-        <w:rPr>
-          <w:rFonts w:ascii="Calibri" w:hAnsi="Calibri"/>
-          <w:color w:val="1E293B"/>
-          <w:sz w:val="20"/>
-        </w:rPr>
-        <w:t>Interviews revealed intense contractor frustration with incumbent field service software:</w:t>
-      </w:r>
-    </w:p>
-    <w:p>
-      <w:pPr>
-        <w:spacing w:before="0" w:after="120" w:line="276" w:lineRule="auto"/>
-      </w:pPr>
-      <w:r>
-        <w:rPr>
-          <w:rFonts w:ascii="Calibri" w:hAnsi="Calibri"/>
-          <w:color w:val="1E293B"/>
-          <w:sz w:val="20"/>
-        </w:rPr>
-        <w:t>1. Pricing Hostage Architecture: ServiceTitan charges $250 to $350 per technician per month, plus exorbitant setup fees ($8,000 to $15,000) and mandatory long-term lock-in contracts.</w:t>
-      </w:r>
-    </w:p>
-    <w:p>
-      <w:pPr>
-        <w:spacing w:before="0" w:after="120" w:line="276" w:lineRule="auto"/>
-      </w:pPr>
-      <w:r>
-        <w:rPr>
-          <w:rFonts w:ascii="Calibri" w:hAnsi="Calibri"/>
-          <w:color w:val="1E293B"/>
-          <w:sz w:val="20"/>
-        </w:rPr>
-        <w:t>2. Feature Bloat &amp; Complexity: Technicians need 45 minutes of training just to close an invoice. Older, experienced journeymen mechanics refuse to use the tablet because the user interface is bloated with consumer marketing upsells.</w:t>
-      </w:r>
-    </w:p>
-    <w:p>
-      <w:pPr>
-        <w:spacing w:before="0" w:after="120" w:line="276" w:lineRule="auto"/>
-      </w:pPr>
-      <w:r>
-        <w:rPr>
-          <w:rFonts w:ascii="Calibri" w:hAnsi="Calibri"/>
-          <w:color w:val="1E293B"/>
-          <w:sz w:val="20"/>
-        </w:rPr>
-        <w:t>3. Cloud Sync Failures: When a technician loses cellular connectivity in a commercial basement, ServiceTitan locks up. Technicians revert to paper work orders, destroying real-time office visibility.</w:t>
-      </w:r>
-    </w:p>
-    <w:p>
-      <w:r>
-        <w:br w:type="page"/>
-      </w:r>
-    </w:p>
-    <w:p>
-      <w:pPr>
-        <w:keepNext/>
-        <w:spacing w:before="280" w:after="80"/>
-      </w:pPr>
-      <w:r>
-        <w:rPr>
-          <w:rFonts w:ascii="Calibri" w:hAnsi="Calibri"/>
-          <w:b/>
-          <w:color w:val="0F172A"/>
-          <w:sz w:val="26"/>
-        </w:rPr>
-        <w:t>SECTION 3: THE FLEETOPS OFFLINE-FIRST ENGINE</w:t>
-      </w:r>
-    </w:p>
-    <w:p>
-      <w:pPr>
-        <w:spacing w:before="0" w:after="120" w:line="276" w:lineRule="auto"/>
-      </w:pPr>
-      <w:r>
-        <w:rPr>
-          <w:rFonts w:ascii="Calibri" w:hAnsi="Calibri"/>
-          <w:color w:val="1E293B"/>
-          <w:sz w:val="20"/>
-        </w:rPr>
-        <w:t>FleetOps was engineered from day one on an offline-first mobile architecture:</w:t>
-      </w:r>
-    </w:p>
-    <w:p>
-      <w:pPr>
-        <w:pStyle w:val="ListBullet"/>
-        <w:spacing w:before="0" w:after="60" w:line="276" w:lineRule="auto"/>
-      </w:pPr>
-      <w:r>
-        <w:rPr>
-          <w:rFonts w:ascii="Calibri" w:hAnsi="Calibri"/>
-          <w:color w:val="1E293B"/>
-          <w:sz w:val="20"/>
-        </w:rPr>
-        <w:t>Embedded Local SQLite Engine: Every work order, customer asset history, and price book item is stored directly in an encrypted local database on the technician's mobile device.</w:t>
-      </w:r>
-    </w:p>
-    <w:p>
-      <w:pPr>
-        <w:pStyle w:val="ListBullet"/>
-        <w:spacing w:before="0" w:after="60" w:line="276" w:lineRule="auto"/>
-      </w:pPr>
-      <w:r>
-        <w:rPr>
-          <w:rFonts w:ascii="Calibri" w:hAnsi="Calibri"/>
-          <w:color w:val="1E293B"/>
-          <w:sz w:val="20"/>
-        </w:rPr>
-        <w:t>Conflict-Free Replicated Data Types (CRDT): When the technician walks out of the basement into cellular coverage, FleetOps executes seamless, bi-directional background synchronization in milliseconds with zero merge conflicts.</w:t>
-      </w:r>
-    </w:p>
-    <w:p>
-      <w:pPr>
-        <w:pStyle w:val="ListBullet"/>
-        <w:spacing w:before="0" w:after="60" w:line="276" w:lineRule="auto"/>
-      </w:pPr>
-      <w:r>
-        <w:rPr>
-          <w:rFonts w:ascii="Calibri" w:hAnsi="Calibri"/>
-          <w:color w:val="1E293B"/>
-          <w:sz w:val="20"/>
-        </w:rPr>
-        <w:t>1-Click Mobile Invoice Generation: Technicians snap a photo of the completed equipment nameplate, review recorded labor hours, and generate an itemized commercial PDF invoice before climbing back into their van.</w:t>
-      </w:r>
-    </w:p>
-    <w:p>
-      <w:r>
-        <w:br w:type="page"/>
-      </w:r>
-    </w:p>
-    <w:p>
-      <w:pPr>
-        <w:keepNext/>
-        <w:spacing w:before="280" w:after="80"/>
-      </w:pPr>
-      <w:r>
-        <w:rPr>
-          <w:rFonts w:ascii="Calibri" w:hAnsi="Calibri"/>
-          <w:b/>
-          <w:color w:val="0F172A"/>
-          <w:sz w:val="26"/>
-        </w:rPr>
-        <w:t>SECTION 4: TRACTION &amp; PILOT UNIT ECONOMICS</w:t>
-      </w:r>
-    </w:p>
-    <w:p>
-      <w:pPr>
-        <w:pStyle w:val="ListBullet"/>
-        <w:spacing w:before="0" w:after="60" w:line="276" w:lineRule="auto"/>
-      </w:pPr>
-      <w:r>
-        <w:rPr>
-          <w:rFonts w:ascii="Calibri" w:hAnsi="Calibri"/>
-          <w:color w:val="1E293B"/>
-          <w:sz w:val="20"/>
-        </w:rPr>
-        <w:t>Active Commercial Contractors: 38 commercial trade contractors deployed across Austin, Dallas, and Denver.</w:t>
-      </w:r>
-    </w:p>
-    <w:p>
-      <w:pPr>
-        <w:pStyle w:val="ListBullet"/>
-        <w:spacing w:before="0" w:after="60" w:line="276" w:lineRule="auto"/>
-      </w:pPr>
-      <w:r>
-        <w:rPr>
-          <w:rFonts w:ascii="Calibri" w:hAnsi="Calibri"/>
-          <w:color w:val="1E293B"/>
-          <w:sz w:val="20"/>
-        </w:rPr>
-        <w:t>Active Mobile Technicians: 182 daily active technicians using FleetOps on iOS and Android.</w:t>
-      </w:r>
-    </w:p>
-    <w:p>
-      <w:pPr>
-        <w:pStyle w:val="ListBullet"/>
-        <w:spacing w:before="0" w:after="60" w:line="276" w:lineRule="auto"/>
-      </w:pPr>
-      <w:r>
-        <w:rPr>
-          <w:rFonts w:ascii="Calibri" w:hAnsi="Calibri"/>
-          <w:color w:val="1E293B"/>
-          <w:sz w:val="20"/>
-        </w:rPr>
-        <w:t>Monthly Recurring Revenue (MRR): $42,600 as of October 2026 (growing 18.5% month-over-month).</w:t>
-      </w:r>
-    </w:p>
-    <w:p>
-      <w:pPr>
-        <w:pStyle w:val="ListBullet"/>
-        <w:spacing w:before="0" w:after="60" w:line="276" w:lineRule="auto"/>
-      </w:pPr>
-      <w:r>
-        <w:rPr>
-          <w:rFonts w:ascii="Calibri" w:hAnsi="Calibri"/>
-          <w:color w:val="1E293B"/>
-          <w:sz w:val="20"/>
-        </w:rPr>
-        <w:t>Net Revenue Retention (NRR): 118.4% driven by contractors adding new technician seats as they expand.</w:t>
-      </w:r>
-    </w:p>
-    <w:p>
-      <w:pPr>
-        <w:pStyle w:val="ListBullet"/>
-        <w:spacing w:before="0" w:after="60" w:line="276" w:lineRule="auto"/>
-      </w:pPr>
-      <w:r>
-        <w:rPr>
-          <w:rFonts w:ascii="Calibri" w:hAnsi="Calibri"/>
-          <w:color w:val="1E293B"/>
-          <w:sz w:val="20"/>
-        </w:rPr>
-        <w:t>Gross Churn: Under 0.8% monthly (industry standard is 2.5%).</w:t>
-      </w:r>
-    </w:p>
-    <w:p>
-      <w:r>
-        <w:br w:type="page"/>
-      </w:r>
-    </w:p>
-    <w:p>
-      <w:pPr>
-        <w:keepNext/>
-        <w:spacing w:before="280" w:after="80"/>
-      </w:pPr>
-      <w:r>
-        <w:rPr>
-          <w:rFonts w:ascii="Calibri" w:hAnsi="Calibri"/>
-          <w:b/>
-          <w:color w:val="0F172A"/>
-          <w:sz w:val="26"/>
-        </w:rPr>
-        <w:t>SECTION 5: SEED FINANCING TERMS &amp; CAPITAL ALLOCATION</w:t>
-      </w:r>
-    </w:p>
-    <w:p>
-      <w:pPr>
-        <w:pStyle w:val="ListBullet"/>
-        <w:spacing w:before="0" w:after="60" w:line="276" w:lineRule="auto"/>
-      </w:pPr>
-      <w:r>
-        <w:rPr>
-          <w:rFonts w:ascii="Calibri" w:hAnsi="Calibri"/>
-          <w:color w:val="1E293B"/>
-          <w:sz w:val="20"/>
-        </w:rPr>
-        <w:t>Round Size: $1,800,000 Seed Preferred Stock Financing.</w:t>
-      </w:r>
-    </w:p>
-    <w:p>
-      <w:pPr>
-        <w:pStyle w:val="ListBullet"/>
-        <w:spacing w:before="0" w:after="60" w:line="276" w:lineRule="auto"/>
-      </w:pPr>
-      <w:r>
-        <w:rPr>
-          <w:rFonts w:ascii="Calibri" w:hAnsi="Calibri"/>
-          <w:color w:val="1E293B"/>
-          <w:sz w:val="20"/>
-        </w:rPr>
-        <w:t>Valuation Cap: $9,000,000 Post-Money Valuation.</w:t>
-      </w:r>
-    </w:p>
-    <w:p>
-      <w:pPr>
-        <w:pStyle w:val="ListBullet"/>
-        <w:spacing w:before="0" w:after="60" w:line="276" w:lineRule="auto"/>
-      </w:pPr>
-      <w:r>
-        <w:rPr>
-          <w:rFonts w:ascii="Calibri" w:hAnsi="Calibri"/>
-          <w:color w:val="1E293B"/>
-          <w:sz w:val="20"/>
-        </w:rPr>
-        <w:t>Capital Deployment: 60% Engineering (scaling offline sync, ERP accounting connectors), 25% Go-To-Market (inside sales targeting commercial trade associations), 15% Operational reserves.</w:t>
-      </w:r>
-    </w:p>
-    <w:p>
-      <w:pPr>
-        <w:pStyle w:val="ListBullet"/>
-        <w:spacing w:before="0" w:after="60" w:line="276" w:lineRule="auto"/>
-      </w:pPr>
-      <w:r>
-        <w:rPr>
-          <w:rFonts w:ascii="Calibri" w:hAnsi="Calibri"/>
-          <w:color w:val="1E293B"/>
-          <w:sz w:val="20"/>
-        </w:rPr>
-        <w:t>18-Month Milestone: Scale from $42k MRR to $200k MRR ($2.4M ARR run-rate) to position for a top-tier Series A.</w:t>
+        <w:t>Mentors say: Sharpen unit economics and customer acquisition playbook.</w:t>
       </w:r>
     </w:p>
     <w:sectPr>
@@ -516,7 +115,7 @@
       <w:jc w:val="right"/>
     </w:pPr>
     <w:r>
-      <w:t xml:space="preserve">FleetOps Trades Mobile Dispatch — Founder Problem Discovery </w:t>
+      <w:t>Alexa Quintero — 10-Slide Pitch Outline &amp; Mentor Feedback</w:t>
     </w:r>
   </w:p>
 </w:hdr>

</xml_diff>

<commit_message>
perf: instant in-memory thread switching with pre-seeded recent chats and background loader
</commit_message>
<xml_diff>
--- a/public/chat_files/alexa_pitch_rough_bullets.docx
+++ b/public/chat_files/alexa_pitch_rough_bullets.docx
@@ -13,7 +13,7 @@
           <w:color w:val="0F172A"/>
           <w:sz w:val="44"/>
         </w:rPr>
-        <w:t>Alexa Quintero — 10-Slide Pitch Outline &amp; Mentor Feedback</w:t>
+        <w:t>FleetOps Trades Mobile Dispatch — Founder Problem Discovery &amp; Seed Pitch Notes</w:t>
       </w:r>
     </w:p>
     <w:p>
@@ -26,7 +26,7 @@
           <w:color w:val="1E293B"/>
           <w:sz w:val="20"/>
         </w:rPr>
-        <w:t>Slide 1: Problem statement — Field service companies waste 14 hrs/week on paper dispatch.</w:t>
+        <w:t>COMPANY: FleetOps Technologies, Inc. · Austin &amp; Denver</w:t>
       </w:r>
     </w:p>
     <w:p>
@@ -39,7 +39,7 @@
           <w:color w:val="1E293B"/>
           <w:sz w:val="20"/>
         </w:rPr>
-        <w:t>Slide 2: Solution — Automated dispatch &amp; electronic signoff on mobile.</w:t>
+        <w:t>FOUNDER &amp; CEO: Alexa Quintero</w:t>
       </w:r>
     </w:p>
     <w:p>
@@ -52,7 +52,7 @@
           <w:color w:val="1E293B"/>
           <w:sz w:val="20"/>
         </w:rPr>
-        <w:t>Slide 3: Market Size — $8.2B TAM in North American trade logistics.</w:t>
+        <w:t>TARGET VERTICAL: Commercial Trade Fleets (Commercial HVAC, Electrical, Commercial Plumbing, Refrigeration)</w:t>
       </w:r>
     </w:p>
     <w:p>
@@ -65,7 +65,27 @@
           <w:color w:val="1E293B"/>
           <w:sz w:val="20"/>
         </w:rPr>
-        <w:t>Slide 4: Traction — 28 pilot contractors, $14K MRR, zero churn in 90 days.</w:t>
+        <w:t>DOCUMENT: Founder Discovery Notes, 35 Contractor Interviews &amp; Seed Financing Architecture</w:t>
+      </w:r>
+    </w:p>
+    <w:p>
+      <w:r>
+        <w:br w:type="page"/>
+      </w:r>
+    </w:p>
+    <w:p>
+      <w:pPr>
+        <w:keepNext/>
+        <w:spacing w:before="280" w:after="80"/>
+      </w:pPr>
+      <w:r>
+        <w:rPr>
+          <w:rFonts w:ascii="Calibri" w:hAnsi="Calibri"/>
+          <w:b/>
+          <w:color w:val="0F172A"/>
+          <w:sz w:val="26"/>
+        </w:rPr>
+        <w:t>SECTION 1: THE DISCONNECTED COMMERCIAL TRADE FLEET</w:t>
       </w:r>
     </w:p>
     <w:p>
@@ -78,7 +98,388 @@
           <w:color w:val="1E293B"/>
           <w:sz w:val="20"/>
         </w:rPr>
-        <w:t>Mentors say: Sharpen unit economics and customer acquisition playbook.</w:t>
+        <w:t>Over four months in summer 2026, Alexa Quintero conducted in-depth, ride-along discovery interviews with thirty-five (35) commercial trade contractors operating between 8 and 60 service vans across Texas, Colorado, and Arizona.</w:t>
+      </w:r>
+    </w:p>
+    <w:p>
+      <w:pPr>
+        <w:spacing w:before="0" w:after="120" w:line="276" w:lineRule="auto"/>
+      </w:pPr>
+      <w:r>
+        <w:rPr>
+          <w:rFonts w:ascii="Calibri" w:hAnsi="Calibri"/>
+          <w:color w:val="1E293B"/>
+          <w:sz w:val="20"/>
+        </w:rPr>
+        <w:t>The central discovery: While residential trade dispatch software has matured (ServiceTitan, Housecall Pro, Jobber), commercial trade fleets operate with fundamentally different requirements that consumer-facing apps fail to address.</w:t>
+      </w:r>
+    </w:p>
+    <w:p>
+      <w:pPr>
+        <w:spacing w:before="0" w:after="120" w:line="276" w:lineRule="auto"/>
+      </w:pPr>
+      <w:r>
+        <w:rPr>
+          <w:rFonts w:ascii="Calibri" w:hAnsi="Calibri"/>
+          <w:color w:val="1E293B"/>
+          <w:sz w:val="20"/>
+        </w:rPr>
+        <w:t>Key Commercial Differences:</w:t>
+      </w:r>
+    </w:p>
+    <w:p>
+      <w:pPr>
+        <w:pStyle w:val="ListBullet"/>
+        <w:spacing w:before="0" w:after="60" w:line="276" w:lineRule="auto"/>
+      </w:pPr>
+      <w:r>
+        <w:rPr>
+          <w:rFonts w:ascii="Calibri" w:hAnsi="Calibri"/>
+          <w:color w:val="1E293B"/>
+          <w:sz w:val="20"/>
+        </w:rPr>
+        <w:t>Multi-Day Industrial Work Orders: Residential apps assume a 90-minute service call with a homeowner. Commercial contractors manage 3-week boiler replacements and chiller overhauls across multiple shift technicians.</w:t>
+      </w:r>
+    </w:p>
+    <w:p>
+      <w:pPr>
+        <w:pStyle w:val="ListBullet"/>
+        <w:spacing w:before="0" w:after="60" w:line="276" w:lineRule="auto"/>
+      </w:pPr>
+      <w:r>
+        <w:rPr>
+          <w:rFonts w:ascii="Calibri" w:hAnsi="Calibri"/>
+          <w:color w:val="1E293B"/>
+          <w:sz w:val="20"/>
+        </w:rPr>
+        <w:t>Basement &amp; Mechanical Room Dead-Zones: Commercial technicians work in subterranean hospital mechanical rooms, concrete parking garages, and industrial manufacturing plants with zero cellular reception. Existing cloud-only apps completely freeze or lose un-synced work orders.</w:t>
+      </w:r>
+    </w:p>
+    <w:p>
+      <w:pPr>
+        <w:pStyle w:val="ListBullet"/>
+        <w:spacing w:before="0" w:after="60" w:line="276" w:lineRule="auto"/>
+      </w:pPr>
+      <w:r>
+        <w:rPr>
+          <w:rFonts w:ascii="Calibri" w:hAnsi="Calibri"/>
+          <w:color w:val="1E293B"/>
+          <w:sz w:val="20"/>
+        </w:rPr>
+        <w:t>Complex Job Costing &amp; Equipment Asset Tracking: Commercial customers demand rooftop HVAC unit asset history, refrigerant reclamation EPA compliance logs, and exact labor-material margin tracking against commercial purchase orders.</w:t>
+      </w:r>
+    </w:p>
+    <w:p>
+      <w:r>
+        <w:br w:type="page"/>
+      </w:r>
+    </w:p>
+    <w:p>
+      <w:pPr>
+        <w:keepNext/>
+        <w:spacing w:before="280" w:after="80"/>
+      </w:pPr>
+      <w:r>
+        <w:rPr>
+          <w:rFonts w:ascii="Calibri" w:hAnsi="Calibri"/>
+          <w:b/>
+          <w:color w:val="0F172A"/>
+          <w:sz w:val="26"/>
+        </w:rPr>
+        <w:t>SECTION 2: WHY CONTRACTORS ARE FLEEING SERVICETITAN</w:t>
+      </w:r>
+    </w:p>
+    <w:p>
+      <w:pPr>
+        <w:spacing w:before="0" w:after="120" w:line="276" w:lineRule="auto"/>
+      </w:pPr>
+      <w:r>
+        <w:rPr>
+          <w:rFonts w:ascii="Calibri" w:hAnsi="Calibri"/>
+          <w:color w:val="1E293B"/>
+          <w:sz w:val="20"/>
+        </w:rPr>
+        <w:t>Interviews revealed intense contractor frustration with incumbent field service software:</w:t>
+      </w:r>
+    </w:p>
+    <w:p>
+      <w:pPr>
+        <w:spacing w:before="0" w:after="120" w:line="276" w:lineRule="auto"/>
+      </w:pPr>
+      <w:r>
+        <w:rPr>
+          <w:rFonts w:ascii="Calibri" w:hAnsi="Calibri"/>
+          <w:color w:val="1E293B"/>
+          <w:sz w:val="20"/>
+        </w:rPr>
+        <w:t>1. Pricing Hostage Architecture: ServiceTitan charges $250 to $350 per technician per month, plus exorbitant setup fees ($8,000 to $15,000) and mandatory long-term lock-in contracts.</w:t>
+      </w:r>
+    </w:p>
+    <w:p>
+      <w:pPr>
+        <w:spacing w:before="0" w:after="120" w:line="276" w:lineRule="auto"/>
+      </w:pPr>
+      <w:r>
+        <w:rPr>
+          <w:rFonts w:ascii="Calibri" w:hAnsi="Calibri"/>
+          <w:color w:val="1E293B"/>
+          <w:sz w:val="20"/>
+        </w:rPr>
+        <w:t>2. Feature Bloat &amp; Complexity: Technicians need 45 minutes of training just to close an invoice. Older, experienced journeymen mechanics refuse to use the tablet because the user interface is bloated with consumer marketing upsells.</w:t>
+      </w:r>
+    </w:p>
+    <w:p>
+      <w:pPr>
+        <w:spacing w:before="0" w:after="120" w:line="276" w:lineRule="auto"/>
+      </w:pPr>
+      <w:r>
+        <w:rPr>
+          <w:rFonts w:ascii="Calibri" w:hAnsi="Calibri"/>
+          <w:color w:val="1E293B"/>
+          <w:sz w:val="20"/>
+        </w:rPr>
+        <w:t>3. Cloud Sync Failures: When a technician loses cellular connectivity in a commercial basement, ServiceTitan locks up. Technicians revert to paper work orders, destroying real-time office visibility.</w:t>
+      </w:r>
+    </w:p>
+    <w:p>
+      <w:r>
+        <w:br w:type="page"/>
+      </w:r>
+    </w:p>
+    <w:p>
+      <w:pPr>
+        <w:keepNext/>
+        <w:spacing w:before="280" w:after="80"/>
+      </w:pPr>
+      <w:r>
+        <w:rPr>
+          <w:rFonts w:ascii="Calibri" w:hAnsi="Calibri"/>
+          <w:b/>
+          <w:color w:val="0F172A"/>
+          <w:sz w:val="26"/>
+        </w:rPr>
+        <w:t>SECTION 3: THE FLEETOPS OFFLINE-FIRST ENGINE</w:t>
+      </w:r>
+    </w:p>
+    <w:p>
+      <w:pPr>
+        <w:spacing w:before="0" w:after="120" w:line="276" w:lineRule="auto"/>
+      </w:pPr>
+      <w:r>
+        <w:rPr>
+          <w:rFonts w:ascii="Calibri" w:hAnsi="Calibri"/>
+          <w:color w:val="1E293B"/>
+          <w:sz w:val="20"/>
+        </w:rPr>
+        <w:t>FleetOps was engineered from day one on an offline-first mobile architecture:</w:t>
+      </w:r>
+    </w:p>
+    <w:p>
+      <w:pPr>
+        <w:pStyle w:val="ListBullet"/>
+        <w:spacing w:before="0" w:after="60" w:line="276" w:lineRule="auto"/>
+      </w:pPr>
+      <w:r>
+        <w:rPr>
+          <w:rFonts w:ascii="Calibri" w:hAnsi="Calibri"/>
+          <w:color w:val="1E293B"/>
+          <w:sz w:val="20"/>
+        </w:rPr>
+        <w:t>Embedded Local SQLite Engine: Every work order, customer asset history, and price book item is stored directly in an encrypted local database on the technician's mobile device.</w:t>
+      </w:r>
+    </w:p>
+    <w:p>
+      <w:pPr>
+        <w:pStyle w:val="ListBullet"/>
+        <w:spacing w:before="0" w:after="60" w:line="276" w:lineRule="auto"/>
+      </w:pPr>
+      <w:r>
+        <w:rPr>
+          <w:rFonts w:ascii="Calibri" w:hAnsi="Calibri"/>
+          <w:color w:val="1E293B"/>
+          <w:sz w:val="20"/>
+        </w:rPr>
+        <w:t>Conflict-Free Replicated Data Types (CRDT): When the technician walks out of the basement into cellular coverage, FleetOps executes seamless, bi-directional background synchronization in milliseconds with zero merge conflicts.</w:t>
+      </w:r>
+    </w:p>
+    <w:p>
+      <w:pPr>
+        <w:pStyle w:val="ListBullet"/>
+        <w:spacing w:before="0" w:after="60" w:line="276" w:lineRule="auto"/>
+      </w:pPr>
+      <w:r>
+        <w:rPr>
+          <w:rFonts w:ascii="Calibri" w:hAnsi="Calibri"/>
+          <w:color w:val="1E293B"/>
+          <w:sz w:val="20"/>
+        </w:rPr>
+        <w:t>1-Click Mobile Invoice Generation: Technicians snap a photo of the completed equipment nameplate, review recorded labor hours, and generate an itemized commercial PDF invoice before climbing back into their van.</w:t>
+      </w:r>
+    </w:p>
+    <w:p>
+      <w:r>
+        <w:br w:type="page"/>
+      </w:r>
+    </w:p>
+    <w:p>
+      <w:pPr>
+        <w:keepNext/>
+        <w:spacing w:before="280" w:after="80"/>
+      </w:pPr>
+      <w:r>
+        <w:rPr>
+          <w:rFonts w:ascii="Calibri" w:hAnsi="Calibri"/>
+          <w:b/>
+          <w:color w:val="0F172A"/>
+          <w:sz w:val="26"/>
+        </w:rPr>
+        <w:t>SECTION 4: TRACTION &amp; PILOT UNIT ECONOMICS</w:t>
+      </w:r>
+    </w:p>
+    <w:p>
+      <w:pPr>
+        <w:pStyle w:val="ListBullet"/>
+        <w:spacing w:before="0" w:after="60" w:line="276" w:lineRule="auto"/>
+      </w:pPr>
+      <w:r>
+        <w:rPr>
+          <w:rFonts w:ascii="Calibri" w:hAnsi="Calibri"/>
+          <w:color w:val="1E293B"/>
+          <w:sz w:val="20"/>
+        </w:rPr>
+        <w:t>Active Commercial Contractors: 38 commercial trade contractors deployed across Austin, Dallas, and Denver.</w:t>
+      </w:r>
+    </w:p>
+    <w:p>
+      <w:pPr>
+        <w:pStyle w:val="ListBullet"/>
+        <w:spacing w:before="0" w:after="60" w:line="276" w:lineRule="auto"/>
+      </w:pPr>
+      <w:r>
+        <w:rPr>
+          <w:rFonts w:ascii="Calibri" w:hAnsi="Calibri"/>
+          <w:color w:val="1E293B"/>
+          <w:sz w:val="20"/>
+        </w:rPr>
+        <w:t>Active Mobile Technicians: 182 daily active technicians using FleetOps on iOS and Android.</w:t>
+      </w:r>
+    </w:p>
+    <w:p>
+      <w:pPr>
+        <w:pStyle w:val="ListBullet"/>
+        <w:spacing w:before="0" w:after="60" w:line="276" w:lineRule="auto"/>
+      </w:pPr>
+      <w:r>
+        <w:rPr>
+          <w:rFonts w:ascii="Calibri" w:hAnsi="Calibri"/>
+          <w:color w:val="1E293B"/>
+          <w:sz w:val="20"/>
+        </w:rPr>
+        <w:t>Monthly Recurring Revenue (MRR): $42,600 as of October 2026 (growing 18.5% month-over-month).</w:t>
+      </w:r>
+    </w:p>
+    <w:p>
+      <w:pPr>
+        <w:pStyle w:val="ListBullet"/>
+        <w:spacing w:before="0" w:after="60" w:line="276" w:lineRule="auto"/>
+      </w:pPr>
+      <w:r>
+        <w:rPr>
+          <w:rFonts w:ascii="Calibri" w:hAnsi="Calibri"/>
+          <w:color w:val="1E293B"/>
+          <w:sz w:val="20"/>
+        </w:rPr>
+        <w:t>Net Revenue Retention (NRR): 118.4% driven by contractors adding new technician seats as they expand.</w:t>
+      </w:r>
+    </w:p>
+    <w:p>
+      <w:pPr>
+        <w:pStyle w:val="ListBullet"/>
+        <w:spacing w:before="0" w:after="60" w:line="276" w:lineRule="auto"/>
+      </w:pPr>
+      <w:r>
+        <w:rPr>
+          <w:rFonts w:ascii="Calibri" w:hAnsi="Calibri"/>
+          <w:color w:val="1E293B"/>
+          <w:sz w:val="20"/>
+        </w:rPr>
+        <w:t>Gross Churn: Under 0.8% monthly (industry standard is 2.5%).</w:t>
+      </w:r>
+    </w:p>
+    <w:p>
+      <w:r>
+        <w:br w:type="page"/>
+      </w:r>
+    </w:p>
+    <w:p>
+      <w:pPr>
+        <w:keepNext/>
+        <w:spacing w:before="280" w:after="80"/>
+      </w:pPr>
+      <w:r>
+        <w:rPr>
+          <w:rFonts w:ascii="Calibri" w:hAnsi="Calibri"/>
+          <w:b/>
+          <w:color w:val="0F172A"/>
+          <w:sz w:val="26"/>
+        </w:rPr>
+        <w:t>SECTION 5: SEED FINANCING TERMS &amp; CAPITAL ALLOCATION</w:t>
+      </w:r>
+    </w:p>
+    <w:p>
+      <w:pPr>
+        <w:pStyle w:val="ListBullet"/>
+        <w:spacing w:before="0" w:after="60" w:line="276" w:lineRule="auto"/>
+      </w:pPr>
+      <w:r>
+        <w:rPr>
+          <w:rFonts w:ascii="Calibri" w:hAnsi="Calibri"/>
+          <w:color w:val="1E293B"/>
+          <w:sz w:val="20"/>
+        </w:rPr>
+        <w:t>Round Size: $1,800,000 Seed Preferred Stock Financing.</w:t>
+      </w:r>
+    </w:p>
+    <w:p>
+      <w:pPr>
+        <w:pStyle w:val="ListBullet"/>
+        <w:spacing w:before="0" w:after="60" w:line="276" w:lineRule="auto"/>
+      </w:pPr>
+      <w:r>
+        <w:rPr>
+          <w:rFonts w:ascii="Calibri" w:hAnsi="Calibri"/>
+          <w:color w:val="1E293B"/>
+          <w:sz w:val="20"/>
+        </w:rPr>
+        <w:t>Valuation Cap: $9,000,000 Post-Money Valuation.</w:t>
+      </w:r>
+    </w:p>
+    <w:p>
+      <w:pPr>
+        <w:pStyle w:val="ListBullet"/>
+        <w:spacing w:before="0" w:after="60" w:line="276" w:lineRule="auto"/>
+      </w:pPr>
+      <w:r>
+        <w:rPr>
+          <w:rFonts w:ascii="Calibri" w:hAnsi="Calibri"/>
+          <w:color w:val="1E293B"/>
+          <w:sz w:val="20"/>
+        </w:rPr>
+        <w:t>Capital Deployment: 60% Engineering (scaling offline sync, ERP accounting connectors), 25% Go-To-Market (inside sales targeting commercial trade associations), 15% Operational reserves.</w:t>
+      </w:r>
+    </w:p>
+    <w:p>
+      <w:pPr>
+        <w:pStyle w:val="ListBullet"/>
+        <w:spacing w:before="0" w:after="60" w:line="276" w:lineRule="auto"/>
+      </w:pPr>
+      <w:r>
+        <w:rPr>
+          <w:rFonts w:ascii="Calibri" w:hAnsi="Calibri"/>
+          <w:color w:val="1E293B"/>
+          <w:sz w:val="20"/>
+        </w:rPr>
+        <w:t>18-Month Milestone: Scale from $42k MRR to $200k MRR ($2.4M ARR run-rate) to position for a top-tier Series A.</w:t>
       </w:r>
     </w:p>
     <w:sectPr>
@@ -115,7 +516,7 @@
       <w:jc w:val="right"/>
     </w:pPr>
     <w:r>
-      <w:t>Alexa Quintero — 10-Slide Pitch Outline &amp; Mentor Feedback</w:t>
+      <w:t xml:space="preserve">FleetOps Trades Mobile Dispatch — Founder Problem Discovery </w:t>
     </w:r>
   </w:p>
 </w:hdr>

</xml_diff>